<commit_message>
agregar enlaces de LinkedIn y actualizar instrucciones de despliegue en Coolify
Co-Authored-By: Claude Sonnet 5 <noreply@anthropic.com>
Claude-Session: https://claude.ai/code/session_01SpQVqm3yaT6CwHUUgq6J8u
</commit_message>
<xml_diff>
--- a/resume/Alejandro_Veloz_CV_ES.docx
+++ b/resume/Alejandro_Veloz_CV_ES.docx
@@ -104,6 +104,27 @@
             <w:sz w:val="19"/>
           </w:rPr>
           <w:t>alejandroveloz.dev</w:t>
+        </w:r>
+      </w:hyperlink>
+      <w:r>
+        <w:rPr>
+          <w:rFonts w:ascii="Arial" w:hAnsi="Arial"/>
+          <w:b/>
+          <w:color w:val="2A394B"/>
+          <w:sz w:val="18"/>
+        </w:rPr>
+        <w:t xml:space="preserve">  |  </w:t>
+      </w:r>
+      <w:hyperlink r:id="rId14">
+        <w:r>
+          <w:rPr>
+            <w:rFonts w:ascii="Arial" w:hAnsi="Arial"/>
+            <w:color w:val="28548C"/>
+            <w:u w:val="single"/>
+            <w:b/>
+            <w:sz w:val="19"/>
+          </w:rPr>
+          <w:t>LinkedIn</w:t>
         </w:r>
       </w:hyperlink>
     </w:p>

</xml_diff>

<commit_message>
Actualizaciones de IA y 3dimensional
</commit_message>
<xml_diff>
--- a/resume/Alejandro_Veloz_CV_ES.docx
+++ b/resume/Alejandro_Veloz_CV_ES.docx
@@ -167,7 +167,7 @@
           <w:rFonts w:ascii="Arial" w:hAnsi="Arial"/>
           <w:sz w:val="18"/>
         </w:rPr>
-        <w:t>Experiencia construyendo arquitecturas mantenibles, modernizando sistemas legacy y dando soporte a aplicaciones críticas en producción. Utiliza flujos de ingeniería asistida por IA y agentes con Claude Code, OpenAI Codex, GitHub Copilot y herramientas basadas en LLM para acelerar el desarrollo, manteniendo la responsabilidad sobre arquitectura, calidad de código y decisiones técnicas.</w:t>
+        <w:t>Desarrolló una metodología con Claude Code para coordinar agentes especializados, conservar el contexto e incorporar pruebas y revisiones de QA y seguridad. La aplicó en Marvin, Easy Quotes y 3Dimensional, manteniendo la responsabilidad sobre producto, arquitectura y entrega.</w:t>
       </w:r>
     </w:p>
     <w:p>
@@ -194,19 +194,15 @@
       </w:pPr>
       <w:r>
         <w:rPr>
-          <w:rFonts w:ascii="Arial" w:hAnsi="Arial"/>
           <w:b/>
-          <w:color w:val="2A394B"/>
-          <w:sz w:val="17"/>
         </w:rPr>
-        <w:t xml:space="preserve">Backend: </w:t>
+        <w:t>Backend:</w:t>
       </w:r>
       <w:r>
         <w:rPr>
-          <w:rFonts w:ascii="Arial" w:hAnsi="Arial"/>
-          <w:sz w:val="17"/>
+          <w:b w:val="0"/>
         </w:rPr>
-        <w:t>C#, .NET Core, .NET Framework, ASP.NET, REST APIs, Golang, Ruby on Rails, Dapper, Entity Framework</w:t>
+        <w:t xml:space="preserve"> C#, .NET Core, .NET Framework, ASP.NET, APIs REST, Go, Ruby on Rails, Entity Framework, Dapper</w:t>
       </w:r>
     </w:p>
     <w:p>
@@ -215,19 +211,15 @@
       </w:pPr>
       <w:r>
         <w:rPr>
-          <w:rFonts w:ascii="Arial" w:hAnsi="Arial"/>
           <w:b/>
-          <w:color w:val="2A394B"/>
-          <w:sz w:val="17"/>
         </w:rPr>
-        <w:t xml:space="preserve">Datos y ETL: </w:t>
+        <w:t>Datos y ETL:</w:t>
       </w:r>
       <w:r>
         <w:rPr>
-          <w:rFonts w:ascii="Arial" w:hAnsi="Arial"/>
-          <w:sz w:val="17"/>
+          <w:b w:val="0"/>
         </w:rPr>
-        <w:t>SQL Server, T-SQL, PostgreSQL, MongoDB, Redis, Azure Data Factory, ETL/ELT, Migración de Datos, Azure Blob Storage, Validación de Datos</w:t>
+        <w:t xml:space="preserve"> SQL Server, T-SQL, Azure Data Factory, Azure Blob Storage, PostgreSQL, Redis, migración y validación de datos</w:t>
       </w:r>
     </w:p>
     <w:p>
@@ -236,19 +228,15 @@
       </w:pPr>
       <w:r>
         <w:rPr>
-          <w:rFonts w:ascii="Arial" w:hAnsi="Arial"/>
           <w:b/>
-          <w:color w:val="2A394B"/>
-          <w:sz w:val="17"/>
         </w:rPr>
-        <w:t xml:space="preserve">Frontend: </w:t>
+        <w:t>Frontend:</w:t>
       </w:r>
       <w:r>
         <w:rPr>
-          <w:rFonts w:ascii="Arial" w:hAnsi="Arial"/>
-          <w:sz w:val="17"/>
+          <w:b w:val="0"/>
         </w:rPr>
-        <w:t>Angular, TypeScript, JavaScript, React, Next.js, HTML, CSS</w:t>
+        <w:t xml:space="preserve"> Angular, TypeScript, JavaScript, React, Next.js, HTML, CSS</w:t>
       </w:r>
     </w:p>
     <w:p>
@@ -257,19 +245,15 @@
       </w:pPr>
       <w:r>
         <w:rPr>
-          <w:rFonts w:ascii="Arial" w:hAnsi="Arial"/>
           <w:b/>
-          <w:color w:val="2A394B"/>
-          <w:sz w:val="17"/>
         </w:rPr>
-        <w:t xml:space="preserve">Arquitectura: </w:t>
+        <w:t>Arquitectura:</w:t>
       </w:r>
       <w:r>
         <w:rPr>
-          <w:rFonts w:ascii="Arial" w:hAnsi="Arial"/>
-          <w:sz w:val="17"/>
+          <w:b w:val="0"/>
         </w:rPr>
-        <w:t>Clean Architecture, SOLID, Patrones de Diseño, Microservices, Arquitectura por Capas, Procesamiento Asíncrono, Modernización Legacy</w:t>
+        <w:t xml:space="preserve"> Clean Architecture, SOLID, monolitos modulares, procesamiento asíncrono, modernización legacy</w:t>
       </w:r>
     </w:p>
     <w:p>
@@ -278,19 +262,15 @@
       </w:pPr>
       <w:r>
         <w:rPr>
-          <w:rFonts w:ascii="Arial" w:hAnsi="Arial"/>
           <w:b/>
-          <w:color w:val="2A394B"/>
-          <w:sz w:val="17"/>
         </w:rPr>
-        <w:t xml:space="preserve">DevOps y Calidad: </w:t>
+        <w:t>DevOps y calidad:</w:t>
       </w:r>
       <w:r>
         <w:rPr>
-          <w:rFonts w:ascii="Arial" w:hAnsi="Arial"/>
-          <w:sz w:val="17"/>
+          <w:b w:val="0"/>
         </w:rPr>
-        <w:t>Docker, Azure DevOps, GitHub Actions, Jenkins, CI/CD, Kubernetes, SonarQube, Datadog, Pruebas Unitarias, Pruebas de Integración</w:t>
+        <w:t xml:space="preserve"> Docker, Azure DevOps, GitHub Actions, Jenkins, SonarQube, Datadog, pruebas unitarias y de integración</w:t>
       </w:r>
     </w:p>
     <w:p>
@@ -299,19 +279,15 @@
       </w:pPr>
       <w:r>
         <w:rPr>
-          <w:rFonts w:ascii="Arial" w:hAnsi="Arial"/>
           <w:b/>
-          <w:color w:val="2A394B"/>
-          <w:sz w:val="17"/>
         </w:rPr>
-        <w:t xml:space="preserve">IA e Ingeniería con Agentes: </w:t>
+        <w:t>IA:</w:t>
       </w:r>
       <w:r>
         <w:rPr>
-          <w:rFonts w:ascii="Arial" w:hAnsi="Arial"/>
-          <w:sz w:val="17"/>
+          <w:b w:val="0"/>
         </w:rPr>
-        <w:t>Claude Code, OpenAI Codex, GitHub Copilot, OpenAI API, Agentes de Programación con IA, Desarrollo Asistido por LLM</w:t>
+        <w:t xml:space="preserve"> Claude Code, OpenAI Codex, GitHub Copilot, OpenAI API; metodología propia de desarrollo con agentes</w:t>
       </w:r>
     </w:p>
     <w:p>
@@ -666,24 +642,6 @@
     </w:p>
     <w:p>
       <w:pPr>
-        <w:pStyle w:val="SectionHeading"/>
-        <w:pBdr>
-          <w:bottom w:val="single" w:sz="8" w:space="2" w:color="B8C0CC"/>
-        </w:pBdr>
-        <w:keepNext/>
-      </w:pPr>
-      <w:r>
-        <w:rPr>
-          <w:rFonts w:ascii="Arial" w:hAnsi="Arial"/>
-          <w:b/>
-          <w:color w:val="2A394B"/>
-          <w:sz w:val="19"/>
-        </w:rPr>
-        <w:t>EXPERIENCIA ADICIONAL</w:t>
-      </w:r>
-    </w:p>
-    <w:p>
-      <w:pPr>
         <w:pStyle w:val="JobCompany"/>
         <w:keepNext/>
       </w:pPr>
@@ -716,7 +674,7 @@
           <w:color w:val="5A5A5A"/>
           <w:sz w:val="18"/>
         </w:rPr>
-        <w:t xml:space="preserve">  |  2022</w:t>
+        <w:t xml:space="preserve">  |  Febrero 2021 - Mayo 2022</w:t>
       </w:r>
     </w:p>
     <w:p>
@@ -792,7 +750,7 @@
           <w:color w:val="5A5A5A"/>
           <w:sz w:val="18"/>
         </w:rPr>
-        <w:t xml:space="preserve">  |  2018 - 2021</w:t>
+        <w:t xml:space="preserve">  |  Agosto 2019 - Febrero 2021</w:t>
       </w:r>
     </w:p>
     <w:p>
@@ -868,7 +826,7 @@
           <w:color w:val="5A5A5A"/>
           <w:sz w:val="18"/>
         </w:rPr>
-        <w:t xml:space="preserve">  |  2018 - 2019</w:t>
+        <w:t xml:space="preserve">  |  Junio 2018 - Julio 2019</w:t>
       </w:r>
     </w:p>
     <w:p>
@@ -1001,7 +959,7 @@
           <w:color w:val="2A394B"/>
           <w:sz w:val="19"/>
         </w:rPr>
-        <w:t>PRODUCTOS SELECCIONADOS</w:t>
+        <w:t>PRODUCTOS Y PROYECTOS SELECCIONADOS</w:t>
       </w:r>
     </w:p>
     <w:p>
@@ -1047,7 +1005,7 @@
           <w:rFonts w:ascii="Arial" w:hAnsi="Arial"/>
           <w:sz w:val="17"/>
         </w:rPr>
-        <w:t>Diseñó la arquitectura y desarrolló una plataforma SaaS multi-tenant para negocios de servicios que incluye citas, clientes, paquetes, pagos, reportes, acceso de personal y recordatorios. Responsable del diseño de producto, arquitectura, desarrollo full stack, modelado de datos, infraestructura, despliegue y evolución continua.</w:t>
+        <w:t>SaaS multi-tenant en producción para negocios de servicios, con citas, clientes, pagos y reportes. Diseñó un monolito modular y asumió producto, arquitectura, desarrollo full stack, datos, infraestructura y despliegue.</w:t>
       </w:r>
     </w:p>
     <w:p>
@@ -1114,7 +1072,7 @@
           <w:rFonts w:ascii="Arial" w:hAnsi="Arial"/>
           <w:sz w:val="17"/>
         </w:rPr>
-        <w:t>Diseñó y desarrolló una plataforma multi-tenant de cotizaciones y flujo comercial con gestión de clientes, catálogos, plantillas reutilizables, precios, descuentos, impuestos, cotizaciones públicas, flujos de aprobación, seguimiento de pagos, branding, dashboards y acceso para equipos.</w:t>
+        <w:t>SaaS multi-tenant en producción para cotizaciones, aprobaciones y seguimiento de pagos. Diseñó un monolito modular y asumió producto, arquitectura, implementación y despliegue.</w:t>
       </w:r>
     </w:p>
     <w:p>
@@ -1123,19 +1081,78 @@
       </w:pPr>
       <w:r>
         <w:rPr>
+          <w:b/>
+        </w:rPr>
+        <w:t>Tecnologías:</w:t>
+      </w:r>
+      <w:r>
+        <w:rPr>
+          <w:b w:val="0"/>
+        </w:rPr>
+        <w:t xml:space="preserve"> TypeScript, React, Fastify, PostgreSQL, Drizzle, Docker, GitHub Actions</w:t>
+      </w:r>
+    </w:p>
+    <w:p>
+      <w:pPr>
+        <w:pStyle w:val="JobCompany"/>
+        <w:keepNext/>
+      </w:pPr>
+      <w:r>
+        <w:rPr>
           <w:rFonts w:ascii="Arial" w:hAnsi="Arial"/>
           <w:b/>
-          <w:color w:val="2A394B"/>
-          <w:sz w:val="17"/>
+          <w:color w:val="203144"/>
+          <w:sz w:val="19"/>
         </w:rPr>
-        <w:t xml:space="preserve">Tecnologías: </w:t>
+        <w:t>3Dimensional</w:t>
       </w:r>
+      <w:r>
+        <w:rPr>
+          <w:rFonts w:ascii="Arial" w:hAnsi="Arial"/>
+          <w:color w:val="5A5A5A"/>
+          <w:sz w:val="18"/>
+        </w:rPr>
+        <w:t xml:space="preserve">  |  </w:t>
+      </w:r>
+      <w:hyperlink r:id="rId15">
+        <w:r>
+          <w:rPr>
+            <w:rFonts w:ascii="Arial" w:hAnsi="Arial"/>
+            <w:color w:val="28548C"/>
+            <w:u w:val="single"/>
+            <w:sz w:val="19"/>
+          </w:rPr>
+          <w:t>3dimensional.mx</w:t>
+        </w:r>
+      </w:hyperlink>
+    </w:p>
+    <w:p>
+      <w:pPr>
+        <w:pStyle w:val="BodyCompact"/>
+      </w:pPr>
       <w:r>
         <w:rPr>
           <w:rFonts w:ascii="Arial" w:hAnsi="Arial"/>
           <w:sz w:val="17"/>
         </w:rPr>
-        <w:t>TypeScript, React, Vite, Fastify, PostgreSQL, Drizzle, Zod, Docker, GitHub Actions</w:t>
+        <w:t>Creó la plataforma de su negocio de impresión 3D: personalizador visual, cotizaciones con PDF e historial y herramientas internas para generar archivos 3MF de fabricación. Definió las decisiones de producto y técnicas, con desarrollo asistido por Claude Code.</w:t>
+      </w:r>
+    </w:p>
+    <w:p>
+      <w:pPr>
+        <w:pStyle w:val="BodyCompact"/>
+      </w:pPr>
+      <w:r>
+        <w:rPr>
+          <w:b/>
+        </w:rPr>
+        <w:t>Tecnologías:</w:t>
+      </w:r>
+      <w:r>
+        <w:rPr>
+          <w:b w:val="0"/>
+        </w:rPr>
+        <w:t xml:space="preserve"> JavaScript, Canvas, Supabase, generación de geometría y archivos 3MF</w:t>
       </w:r>
     </w:p>
     <w:p>

</xml_diff>